<commit_message>
Added Presentation 1 slides
</commit_message>
<xml_diff>
--- a/fall-2021/agendas/Agenda 9_13.docx
+++ b/fall-2021/agendas/Agenda 9_13.docx
@@ -33,19 +33,10 @@
         </w:rPr>
       </w:pPr>
       <w:r>
-        <w:t>September 29th is our first presentation (~</w:t>
-      </w:r>
-      <w:r>
-        <w:t>2</w:t>
-      </w:r>
-      <w:r>
-        <w:t xml:space="preserve"> week</w:t>
-      </w:r>
-      <w:r>
-        <w:t>s</w:t>
-      </w:r>
-      <w:r>
-        <w:t xml:space="preserve"> from today)</w:t>
+        <w:rPr>
+          <w:lang w:val="en-IN"/>
+        </w:rPr>
+        <w:t>Deciding how to spend the 500 USD funding from the VIP competition</w:t>
       </w:r>
     </w:p>
     <w:p>
@@ -54,6 +45,37 @@
           <w:ilvl w:val="0"/>
           <w:numId w:val="1"/>
         </w:numPr>
+        <w:rPr>
+          <w:lang w:val="en-IN"/>
+        </w:rPr>
+      </w:pPr>
+      <w:r>
+        <w:rPr>
+          <w:lang w:val="en-IN"/>
+        </w:rPr>
+        <w:t>Need to change timings so that Meryem can join in (Re-do the poll)</w:t>
+      </w:r>
+    </w:p>
+    <w:p>
+      <w:pPr>
+        <w:numPr>
+          <w:ilvl w:val="0"/>
+          <w:numId w:val="1"/>
+        </w:numPr>
+        <w:rPr>
+          <w:lang w:val="en-IN"/>
+        </w:rPr>
+      </w:pPr>
+      <w:r>
+        <w:t>September 29th is our first presentation (~2 weeks from today)</w:t>
+      </w:r>
+    </w:p>
+    <w:p>
+      <w:pPr>
+        <w:numPr>
+          <w:ilvl w:val="0"/>
+          <w:numId w:val="1"/>
+        </w:numPr>
       </w:pPr>
       <w:r>
         <w:t>Explanation of how meetings usually work</w:t>
@@ -436,6 +458,7 @@
         </w:numPr>
       </w:pPr>
       <w:r>
+        <w:lastRenderedPageBreak/>
         <w:t>Sambhav demo</w:t>
       </w:r>
       <w:r>

</xml_diff>